<commit_message>
Tentativa de diagramas mas o chat é mt complicado
</commit_message>
<xml_diff>
--- a/ERS/ERS - SGPDC.docx
+++ b/ERS/ERS - SGPDC.docx
@@ -2345,12 +2345,42 @@
     </w:p>
     <w:p>
       <w:r>
-        <w:t>Cada aluno deverá estar obrigatoriamente vinculado a uma turma, pois essa associação será a base para geração e controle das mensalidades. Também será possível gerenciar os horários das turmas por meio de uma agenda geral da escola.</w:t>
+        <w:t>Cada aluno deverá estar obrigatoriamente vinculado a uma</w:t>
+      </w:r>
+      <w:r>
+        <w:t xml:space="preserve"> ou mais</w:t>
+      </w:r>
+      <w:r>
+        <w:t xml:space="preserve"> turma</w:t>
+      </w:r>
+      <w:r>
+        <w:t>s</w:t>
+      </w:r>
+      <w:r>
+        <w:t>, pois essa associação será a base para geração e controle das mensalidades. Também será possível gerenciar os horários das turmas por meio de uma agenda geral da escola.</w:t>
       </w:r>
     </w:p>
     <w:p>
       <w:r>
-        <w:t>A agenda permitirá visualizar os dias e horários de cada turma, vinculando-a a um professor responsável. Professores terão acesso restrito à visualização de seus próprios horários de aula e, quando aplicável, aos horários das aulas que frequentam na escola. As regras financeiras relacionadas às aulas realizadas por professores (caso existam cobranças ou remunerações específicas) serão analisadas e detalhadas posteriormente, podendo gerar ajustes no escopo.</w:t>
+        <w:t xml:space="preserve">A agenda permitirá visualizar os dias e horários de cada turma, vinculando-a a um </w:t>
+      </w:r>
+      <w:r>
+        <w:t xml:space="preserve">ou mais </w:t>
+      </w:r>
+      <w:r>
+        <w:t>professor</w:t>
+      </w:r>
+      <w:r>
+        <w:t>es</w:t>
+      </w:r>
+      <w:r>
+        <w:t xml:space="preserve"> responsáve</w:t>
+      </w:r>
+      <w:r>
+        <w:t>is</w:t>
+      </w:r>
+      <w:r>
+        <w:t>. Professores terão acesso restrito à visualização de seus próprios horários de aula e, quando aplicável, aos horários das aulas que frequentam na escola.</w:t>
       </w:r>
     </w:p>
     <w:p>
@@ -2461,7 +2491,10 @@
     </w:p>
     <w:p>
       <w:r>
-        <w:t>Fornecer as definições de todos os termos, acrônimos e abreviações necessárias para interpretar de modo apropriado a ERS.</w:t>
+        <w:t>Fornecer</w:t>
+      </w:r>
+      <w:r>
+        <w:t xml:space="preserve"> as definições de todos os termos, acrônimos e abreviações necessárias para interpretar de modo apropriado a ERS.</w:t>
       </w:r>
     </w:p>
     <w:p>
@@ -3686,14 +3719,7 @@
                 <w:rFonts w:asciiTheme="minorHAnsi" w:hAnsiTheme="minorHAnsi" w:cstheme="minorHAnsi"/>
                 <w:sz w:val="18"/>
               </w:rPr>
-              <w:t xml:space="preserve"> - </w:t>
-            </w:r>
-            <w:r>
-              <w:rPr>
-                <w:rFonts w:asciiTheme="minorHAnsi" w:hAnsiTheme="minorHAnsi" w:cstheme="minorHAnsi"/>
-                <w:sz w:val="18"/>
-              </w:rPr>
-              <w:t>(entradas)</w:t>
+              <w:t xml:space="preserve"> </w:t>
             </w:r>
             <w:r>
               <w:rPr>
@@ -3829,6 +3855,26 @@
             <w:pPr>
               <w:jc w:val="left"/>
               <w:rPr>
+                <w:rFonts w:asciiTheme="minorHAnsi" w:hAnsiTheme="minorHAnsi" w:cstheme="minorHAnsi"/>
+                <w:b/>
+                <w:sz w:val="18"/>
+              </w:rPr>
+            </w:pPr>
+          </w:p>
+          <w:p>
+            <w:pPr>
+              <w:jc w:val="left"/>
+              <w:rPr>
+                <w:rFonts w:asciiTheme="minorHAnsi" w:hAnsiTheme="minorHAnsi" w:cstheme="minorHAnsi"/>
+                <w:b/>
+                <w:sz w:val="18"/>
+              </w:rPr>
+            </w:pPr>
+          </w:p>
+          <w:p>
+            <w:pPr>
+              <w:jc w:val="left"/>
+              <w:rPr>
                 <w:rFonts w:cstheme="minorHAnsi"/>
                 <w:b/>
                 <w:sz w:val="18"/>
@@ -3840,7 +3886,6 @@
                 <w:b/>
                 <w:sz w:val="18"/>
               </w:rPr>
-              <w:lastRenderedPageBreak/>
               <w:t xml:space="preserve">Título: </w:t>
             </w:r>
             <w:r>
@@ -3955,6 +4000,16 @@
             <w:pPr>
               <w:jc w:val="left"/>
               <w:rPr>
+                <w:rFonts w:asciiTheme="minorHAnsi" w:hAnsiTheme="minorHAnsi" w:cstheme="minorHAnsi"/>
+                <w:b/>
+                <w:sz w:val="18"/>
+              </w:rPr>
+            </w:pPr>
+          </w:p>
+          <w:p>
+            <w:pPr>
+              <w:jc w:val="left"/>
+              <w:rPr>
                 <w:rFonts w:cstheme="minorHAnsi"/>
                 <w:b/>
                 <w:sz w:val="18"/>
@@ -4073,6 +4128,16 @@
             <w:pPr>
               <w:jc w:val="left"/>
               <w:rPr>
+                <w:rFonts w:asciiTheme="minorHAnsi" w:hAnsiTheme="minorHAnsi" w:cstheme="minorHAnsi"/>
+                <w:b/>
+                <w:sz w:val="18"/>
+              </w:rPr>
+            </w:pPr>
+          </w:p>
+          <w:p>
+            <w:pPr>
+              <w:jc w:val="left"/>
+              <w:rPr>
                 <w:rFonts w:cstheme="minorHAnsi"/>
                 <w:b/>
                 <w:sz w:val="18"/>
@@ -4192,18 +4257,27 @@
             <w:pPr>
               <w:jc w:val="left"/>
               <w:rPr>
+                <w:rFonts w:asciiTheme="minorHAnsi" w:hAnsiTheme="minorHAnsi" w:cstheme="minorHAnsi"/>
+                <w:sz w:val="18"/>
+              </w:rPr>
+            </w:pPr>
+            <w:r>
+              <w:rPr>
+                <w:rFonts w:asciiTheme="minorHAnsi" w:hAnsiTheme="minorHAnsi" w:cstheme="minorHAnsi"/>
+                <w:sz w:val="18"/>
+              </w:rPr>
+              <w:t xml:space="preserve"> </w:t>
+            </w:r>
+          </w:p>
+          <w:p>
+            <w:pPr>
+              <w:jc w:val="left"/>
+              <w:rPr>
                 <w:rFonts w:cstheme="minorHAnsi"/>
                 <w:b/>
                 <w:sz w:val="18"/>
               </w:rPr>
             </w:pPr>
-            <w:r>
-              <w:rPr>
-                <w:rFonts w:asciiTheme="minorHAnsi" w:hAnsiTheme="minorHAnsi" w:cstheme="minorHAnsi"/>
-                <w:sz w:val="18"/>
-              </w:rPr>
-              <w:t xml:space="preserve"> </w:t>
-            </w:r>
             <w:r>
               <w:rPr>
                 <w:rFonts w:asciiTheme="minorHAnsi" w:hAnsiTheme="minorHAnsi" w:cstheme="minorHAnsi"/>
@@ -5137,6 +5211,7 @@
         <w:pStyle w:val="Exemplo"/>
       </w:pPr>
       <w:r>
+        <w:lastRenderedPageBreak/>
         <w:t xml:space="preserve">O </w:t>
       </w:r>
       <w:r>
@@ -5176,7 +5251,6 @@
       </w:pPr>
       <w:bookmarkStart w:id="12" w:name="_Toc204880582"/>
       <w:r>
-        <w:lastRenderedPageBreak/>
         <w:t>2.</w:t>
       </w:r>
       <w:r>
@@ -5446,6 +5520,8 @@
             <w:pPr>
               <w:rPr>
                 <w:rFonts w:asciiTheme="minorHAnsi" w:hAnsiTheme="minorHAnsi" w:cstheme="minorHAnsi"/>
+                <w:b/>
+                <w:bCs/>
                 <w:sz w:val="18"/>
                 <w:szCs w:val="18"/>
               </w:rPr>
@@ -5453,6 +5529,8 @@
             <w:r>
               <w:rPr>
                 <w:rFonts w:asciiTheme="minorHAnsi" w:hAnsiTheme="minorHAnsi" w:cstheme="minorHAnsi"/>
+                <w:b/>
+                <w:bCs/>
                 <w:sz w:val="18"/>
                 <w:szCs w:val="18"/>
               </w:rPr>
@@ -5501,14 +5579,14 @@
                 <w:numId w:val="19"/>
               </w:numPr>
               <w:rPr>
-                <w:rFonts w:cstheme="minorHAnsi"/>
+                <w:rFonts w:asciiTheme="minorHAnsi" w:hAnsiTheme="minorHAnsi" w:cstheme="minorHAnsi"/>
                 <w:sz w:val="18"/>
                 <w:szCs w:val="18"/>
               </w:rPr>
             </w:pPr>
             <w:r>
               <w:rPr>
-                <w:rFonts w:cstheme="minorHAnsi"/>
+                <w:rFonts w:asciiTheme="minorHAnsi" w:hAnsiTheme="minorHAnsi" w:cstheme="minorHAnsi"/>
                 <w:sz w:val="18"/>
                 <w:szCs w:val="18"/>
               </w:rPr>
@@ -5523,14 +5601,14 @@
                 <w:numId w:val="19"/>
               </w:numPr>
               <w:rPr>
-                <w:rFonts w:cstheme="minorHAnsi"/>
+                <w:rFonts w:asciiTheme="minorHAnsi" w:hAnsiTheme="minorHAnsi" w:cstheme="minorHAnsi"/>
                 <w:sz w:val="18"/>
                 <w:szCs w:val="18"/>
               </w:rPr>
             </w:pPr>
             <w:r>
               <w:rPr>
-                <w:rFonts w:cstheme="minorHAnsi"/>
+                <w:rFonts w:asciiTheme="minorHAnsi" w:hAnsiTheme="minorHAnsi" w:cstheme="minorHAnsi"/>
                 <w:sz w:val="18"/>
                 <w:szCs w:val="18"/>
               </w:rPr>
@@ -5545,14 +5623,14 @@
                 <w:numId w:val="19"/>
               </w:numPr>
               <w:rPr>
-                <w:rFonts w:cstheme="minorHAnsi"/>
+                <w:rFonts w:asciiTheme="minorHAnsi" w:hAnsiTheme="minorHAnsi" w:cstheme="minorHAnsi"/>
                 <w:sz w:val="18"/>
                 <w:szCs w:val="18"/>
               </w:rPr>
             </w:pPr>
             <w:r>
               <w:rPr>
-                <w:rFonts w:cstheme="minorHAnsi"/>
+                <w:rFonts w:asciiTheme="minorHAnsi" w:hAnsiTheme="minorHAnsi" w:cstheme="minorHAnsi"/>
                 <w:sz w:val="18"/>
                 <w:szCs w:val="18"/>
               </w:rPr>
@@ -5567,14 +5645,14 @@
                 <w:numId w:val="19"/>
               </w:numPr>
               <w:rPr>
-                <w:rFonts w:cstheme="minorHAnsi"/>
+                <w:rFonts w:asciiTheme="minorHAnsi" w:hAnsiTheme="minorHAnsi" w:cstheme="minorHAnsi"/>
                 <w:sz w:val="18"/>
                 <w:szCs w:val="18"/>
               </w:rPr>
             </w:pPr>
             <w:r>
               <w:rPr>
-                <w:rFonts w:cstheme="minorHAnsi"/>
+                <w:rFonts w:asciiTheme="minorHAnsi" w:hAnsiTheme="minorHAnsi" w:cstheme="minorHAnsi"/>
                 <w:sz w:val="18"/>
                 <w:szCs w:val="18"/>
               </w:rPr>
@@ -5606,14 +5684,14 @@
                 <w:numId w:val="20"/>
               </w:numPr>
               <w:rPr>
-                <w:rFonts w:cstheme="minorHAnsi"/>
+                <w:rFonts w:asciiTheme="minorHAnsi" w:hAnsiTheme="minorHAnsi" w:cstheme="minorHAnsi"/>
                 <w:sz w:val="18"/>
                 <w:szCs w:val="18"/>
               </w:rPr>
             </w:pPr>
             <w:r>
               <w:rPr>
-                <w:rFonts w:cstheme="minorHAnsi"/>
+                <w:rFonts w:asciiTheme="minorHAnsi" w:hAnsiTheme="minorHAnsi" w:cstheme="minorHAnsi"/>
                 <w:sz w:val="18"/>
                 <w:szCs w:val="18"/>
               </w:rPr>
@@ -5628,14 +5706,14 @@
                 <w:numId w:val="20"/>
               </w:numPr>
               <w:rPr>
-                <w:rFonts w:cstheme="minorHAnsi"/>
+                <w:rFonts w:asciiTheme="minorHAnsi" w:hAnsiTheme="minorHAnsi" w:cstheme="minorHAnsi"/>
                 <w:sz w:val="18"/>
                 <w:szCs w:val="18"/>
               </w:rPr>
             </w:pPr>
             <w:r>
               <w:rPr>
-                <w:rFonts w:cstheme="minorHAnsi"/>
+                <w:rFonts w:asciiTheme="minorHAnsi" w:hAnsiTheme="minorHAnsi" w:cstheme="minorHAnsi"/>
                 <w:sz w:val="18"/>
                 <w:szCs w:val="18"/>
               </w:rPr>
@@ -5650,14 +5728,14 @@
                 <w:numId w:val="20"/>
               </w:numPr>
               <w:rPr>
-                <w:rFonts w:cstheme="minorHAnsi"/>
+                <w:rFonts w:asciiTheme="minorHAnsi" w:hAnsiTheme="minorHAnsi" w:cstheme="minorHAnsi"/>
                 <w:sz w:val="18"/>
                 <w:szCs w:val="18"/>
               </w:rPr>
             </w:pPr>
             <w:r>
               <w:rPr>
-                <w:rFonts w:cstheme="minorHAnsi"/>
+                <w:rFonts w:asciiTheme="minorHAnsi" w:hAnsiTheme="minorHAnsi" w:cstheme="minorHAnsi"/>
                 <w:sz w:val="18"/>
                 <w:szCs w:val="18"/>
               </w:rPr>
@@ -5829,6 +5907,7 @@
                 <w:sz w:val="18"/>
                 <w:szCs w:val="18"/>
               </w:rPr>
+              <w:lastRenderedPageBreak/>
               <w:t>E-mail</w:t>
             </w:r>
           </w:p>
@@ -5931,7 +6010,6 @@
                 <w:sz w:val="18"/>
                 <w:szCs w:val="18"/>
               </w:rPr>
-              <w:lastRenderedPageBreak/>
               <w:t>Terá acesso ao sistema.</w:t>
             </w:r>
           </w:p>
@@ -6373,7 +6451,17 @@
                 <w:sz w:val="18"/>
                 <w:szCs w:val="18"/>
               </w:rPr>
-              <w:t>4. Regras Gerais</w:t>
+              <w:t>3</w:t>
+            </w:r>
+            <w:r>
+              <w:rPr>
+                <w:rFonts w:asciiTheme="minorHAnsi" w:hAnsiTheme="minorHAnsi" w:cstheme="minorHAnsi"/>
+                <w:b/>
+                <w:bCs/>
+                <w:sz w:val="18"/>
+                <w:szCs w:val="18"/>
+              </w:rPr>
+              <w:t>. Regras Gerais</w:t>
             </w:r>
           </w:p>
           <w:p>
@@ -6509,10 +6597,7 @@
           <w:p>
             <w:pPr>
               <w:pStyle w:val="PargrafodaLista"/>
-              <w:numPr>
-                <w:ilvl w:val="0"/>
-                <w:numId w:val="25"/>
-              </w:numPr>
+              <w:ind w:left="1080"/>
               <w:rPr>
                 <w:rFonts w:asciiTheme="minorHAnsi" w:hAnsiTheme="minorHAnsi" w:cstheme="minorHAnsi"/>
               </w:rPr>
@@ -6562,10 +6647,10 @@
               </w:rPr>
               <w:lastRenderedPageBreak/>
               <w:drawing>
-                <wp:inline distT="0" distB="0" distL="0" distR="0" wp14:anchorId="3E1A80EF" wp14:editId="6447FEF2">
-                  <wp:extent cx="2947725" cy="3644900"/>
-                  <wp:effectExtent l="0" t="0" r="5080" b="0"/>
-                  <wp:docPr id="939642016" name="Imagem 5"/>
+                <wp:inline distT="0" distB="0" distL="0" distR="0" wp14:anchorId="5B59C8A2" wp14:editId="5072F38B">
+                  <wp:extent cx="3014133" cy="5692414"/>
+                  <wp:effectExtent l="0" t="0" r="0" b="3810"/>
+                  <wp:docPr id="1376068922" name="Imagem 6"/>
                   <wp:cNvGraphicFramePr>
                     <a:graphicFrameLocks xmlns:a="http://schemas.openxmlformats.org/drawingml/2006/main" noChangeAspect="1"/>
                   </wp:cNvGraphicFramePr>
@@ -6573,7 +6658,7 @@
                     <a:graphicData uri="http://schemas.openxmlformats.org/drawingml/2006/picture">
                       <pic:pic xmlns:pic="http://schemas.openxmlformats.org/drawingml/2006/picture">
                         <pic:nvPicPr>
-                          <pic:cNvPr id="0" name="Picture 10"/>
+                          <pic:cNvPr id="0" name="Picture 2"/>
                           <pic:cNvPicPr>
                             <a:picLocks noChangeAspect="1" noChangeArrowheads="1"/>
                           </pic:cNvPicPr>
@@ -6594,7 +6679,7 @@
                         <pic:spPr bwMode="auto">
                           <a:xfrm>
                             <a:off x="0" y="0"/>
-                            <a:ext cx="2973993" cy="3677381"/>
+                            <a:ext cx="3019965" cy="5703428"/>
                           </a:xfrm>
                           <a:prstGeom prst="rect">
                             <a:avLst/>
@@ -6781,6 +6866,7 @@
                 <w:rFonts w:cstheme="minorHAnsi"/>
                 <w:noProof/>
               </w:rPr>
+              <w:lastRenderedPageBreak/>
               <w:t>h</w:t>
             </w:r>
             <w:r>
@@ -6917,7 +7003,6 @@
                 <w:sz w:val="22"/>
                 <w:szCs w:val="22"/>
               </w:rPr>
-              <w:lastRenderedPageBreak/>
               <w:t>Construir o Protótipo que envolve a funções geradas pela Estória, se aplicável. Para implementações de backends não se aplica.</w:t>
             </w:r>
           </w:p>
@@ -7465,6 +7550,7 @@
                 <w:sz w:val="22"/>
                 <w:szCs w:val="22"/>
               </w:rPr>
+              <w:lastRenderedPageBreak/>
               <w:t>Em caso de sucesso, o sistema grava os detalhes do pagamento no banco de dados.</w:t>
             </w:r>
           </w:p>
@@ -7964,7 +8050,6 @@
                 <w:sz w:val="22"/>
                 <w:szCs w:val="22"/>
               </w:rPr>
-              <w:lastRenderedPageBreak/>
               <w:t>Confirmação e Persistência</w:t>
             </w:r>
             <w:r>
@@ -8388,6 +8473,7 @@
                 <w:sz w:val="22"/>
                 <w:szCs w:val="22"/>
               </w:rPr>
+              <w:lastRenderedPageBreak/>
               <w:t>O diagrama ER deve apresentar a modelagem de tabelas do banco de dados e seus relacionamentos no contexto do sistema aplicada a esta estória.</w:t>
             </w:r>
           </w:p>
@@ -8492,7 +8578,6 @@
                 <w:noProof/>
                 <w:sz w:val="22"/>
               </w:rPr>
-              <w:lastRenderedPageBreak/>
               <w:drawing>
                 <wp:inline distT="0" distB="0" distL="0" distR="0" wp14:anchorId="2BE71547" wp14:editId="2BE71548">
                   <wp:extent cx="3042138" cy="2221786"/>
@@ -12719,6 +12804,7 @@
   <w:style w:type="character" w:default="1" w:styleId="Fontepargpadro">
     <w:name w:val="Default Paragraph Font"/>
     <w:uiPriority w:val="1"/>
+    <w:semiHidden/>
     <w:unhideWhenUsed/>
   </w:style>
   <w:style w:type="table" w:default="1" w:styleId="Tabelanormal">

</xml_diff>

<commit_message>
USEI A CABEÇAAAAA PRA ARRUMAAAR
</commit_message>
<xml_diff>
--- a/ERS/ERS - SGPDC.docx
+++ b/ERS/ERS - SGPDC.docx
@@ -6640,17 +6640,16 @@
             </w:pPr>
             <w:r>
               <w:rPr>
-                <w:rFonts w:asciiTheme="minorHAnsi" w:hAnsiTheme="minorHAnsi" w:cstheme="minorHAnsi"/>
-                <w:noProof/>
-                <w:sz w:val="22"/>
-                <w:szCs w:val="22"/>
+                <w:rFonts w:cstheme="minorHAnsi"/>
+                <w:noProof/>
+                <w:sz w:val="22"/>
               </w:rPr>
               <w:lastRenderedPageBreak/>
               <w:drawing>
-                <wp:inline distT="0" distB="0" distL="0" distR="0" wp14:anchorId="5B59C8A2" wp14:editId="5072F38B">
-                  <wp:extent cx="3014133" cy="5692414"/>
-                  <wp:effectExtent l="0" t="0" r="0" b="3810"/>
-                  <wp:docPr id="1376068922" name="Imagem 6"/>
+                <wp:inline distT="0" distB="0" distL="0" distR="0" wp14:anchorId="50796AC9" wp14:editId="60739EFC">
+                  <wp:extent cx="2636520" cy="4686255"/>
+                  <wp:effectExtent l="0" t="0" r="0" b="635"/>
+                  <wp:docPr id="1427601328" name="Imagem 5"/>
                   <wp:cNvGraphicFramePr>
                     <a:graphicFrameLocks xmlns:a="http://schemas.openxmlformats.org/drawingml/2006/main" noChangeAspect="1"/>
                   </wp:cNvGraphicFramePr>
@@ -6658,7 +6657,7 @@
                     <a:graphicData uri="http://schemas.openxmlformats.org/drawingml/2006/picture">
                       <pic:pic xmlns:pic="http://schemas.openxmlformats.org/drawingml/2006/picture">
                         <pic:nvPicPr>
-                          <pic:cNvPr id="0" name="Picture 2"/>
+                          <pic:cNvPr id="0" name="Picture 1"/>
                           <pic:cNvPicPr>
                             <a:picLocks noChangeAspect="1" noChangeArrowheads="1"/>
                           </pic:cNvPicPr>
@@ -6679,7 +6678,7 @@
                         <pic:spPr bwMode="auto">
                           <a:xfrm>
                             <a:off x="0" y="0"/>
-                            <a:ext cx="3019965" cy="5703428"/>
+                            <a:ext cx="2641360" cy="4694858"/>
                           </a:xfrm>
                           <a:prstGeom prst="rect">
                             <a:avLst/>
@@ -6866,7 +6865,6 @@
                 <w:rFonts w:cstheme="minorHAnsi"/>
                 <w:noProof/>
               </w:rPr>
-              <w:lastRenderedPageBreak/>
               <w:t>h</w:t>
             </w:r>
             <w:r>
@@ -7550,7 +7548,6 @@
                 <w:sz w:val="22"/>
                 <w:szCs w:val="22"/>
               </w:rPr>
-              <w:lastRenderedPageBreak/>
               <w:t>Em caso de sucesso, o sistema grava os detalhes do pagamento no banco de dados.</w:t>
             </w:r>
           </w:p>
@@ -7926,6 +7923,7 @@
                 <w:sz w:val="22"/>
                 <w:szCs w:val="22"/>
               </w:rPr>
+              <w:lastRenderedPageBreak/>
               <w:t>Processamento do Pagamento</w:t>
             </w:r>
             <w:r>
@@ -8473,7 +8471,6 @@
                 <w:sz w:val="22"/>
                 <w:szCs w:val="22"/>
               </w:rPr>
-              <w:lastRenderedPageBreak/>
               <w:t>O diagrama ER deve apresentar a modelagem de tabelas do banco de dados e seus relacionamentos no contexto do sistema aplicada a esta estória.</w:t>
             </w:r>
           </w:p>
@@ -8578,6 +8575,7 @@
                 <w:noProof/>
                 <w:sz w:val="22"/>
               </w:rPr>
+              <w:lastRenderedPageBreak/>
               <w:drawing>
                 <wp:inline distT="0" distB="0" distL="0" distR="0" wp14:anchorId="2BE71547" wp14:editId="2BE71548">
                   <wp:extent cx="3042138" cy="2221786"/>

</xml_diff>